<commit_message>
Fix h1/<title> tag confusion in W3L1 Extension and Support worksheets
Same fix as 35f195c, applied now that these two files are closed.
</commit_message>
<xml_diff>
--- a/resources/week-03/W3L1 - Planning Your Heading Hierarchy - Extension (Above).docx
+++ b/resources/week-03/W3L1 - Planning Your Heading Hierarchy - Extension (Above).docx
@@ -335,7 +335,7 @@
                 <w:sz w:val="20"/>
                 <w:szCs w:val="20"/>
               </w:rPr>
-              <w:t xml:space="preserve">h1 - Page title:</w:t>
+              <w:t xml:space="preserve">h1 - Main heading:</w:t>
             </w:r>
           </w:p>
           <w:p>
@@ -392,7 +392,7 @@
                 <w:sz w:val="20"/>
                 <w:szCs w:val="20"/>
               </w:rPr>
-              <w:t xml:space="preserve">h2 - Section 1 title, and what the paragraph will say:</w:t>
+              <w:t xml:space="preserve">h2 - Section 1 heading, and what the paragraph will say:</w:t>
             </w:r>
           </w:p>
           <w:p>
@@ -457,7 +457,7 @@
                 <w:sz w:val="20"/>
                 <w:szCs w:val="20"/>
               </w:rPr>
-              <w:t xml:space="preserve">h2 - Section 2 title, and what the paragraph will say:</w:t>
+              <w:t xml:space="preserve">h2 - Section 2 heading, and what the paragraph will say:</w:t>
             </w:r>
           </w:p>
           <w:p>
@@ -522,7 +522,7 @@
                 <w:sz w:val="20"/>
                 <w:szCs w:val="20"/>
               </w:rPr>
-              <w:t xml:space="preserve">h2 - Section 3 title, and what the paragraph will say:</w:t>
+              <w:t xml:space="preserve">h2 - Section 3 heading, and what the paragraph will say:</w:t>
             </w:r>
           </w:p>
           <w:p>
@@ -628,7 +628,7 @@
           <w:sz w:val="22"/>
           <w:szCs w:val="22"/>
         </w:rPr>
-        <w:t xml:space="preserve">Exit ticket: Which heading level would you use for a page's main title, and which for a section title?</w:t>
+        <w:t xml:space="preserve">Exit ticket: Which heading level would you use for a page's main heading, and which for a section heading?</w:t>
       </w:r>
     </w:p>
     <w:p>

</xml_diff>